<commit_message>
Update resume with Bolesa S3/Redis and MySQL experience.
Co-authored-by: Cursor <cursoragent@cursor.com>
</commit_message>
<xml_diff>
--- a/Maher_Mostafa_Backend_Software_Engineer_Resume.docx
+++ b/Maher_Mostafa_Backend_Software_Engineer_Resume.docx
@@ -638,7 +638,7 @@
           <w:szCs w:val="15"/>
           <w:rtl w:val="0"/>
         </w:rPr>
-        <w:t xml:space="preserve">Backend Software Engineer specializing in Laravel, PHP, and PostgreSQL. Experienced in building and maintaining production backend systems for financial workflows, payment integrations, multi-tenant applications, and operational platforms, with a strong focus on data correctness, reliable processing, and maintainable service boundaries.</w:t>
+        <w:t xml:space="preserve">Backend Software Engineer specializing in Laravel, PHP, PostgreSQL, and MySQL. Experienced building and maintaining production backend systems for financial workflows, payment integrations, multi-tenant applications, and operational platforms—using Redis for queues/caching and AWS S3 for document storage—with a strong focus on data correctness, reliable processing, and maintainable service boundaries.</w:t>
       </w:r>
       <w:r>
         <w:rPr>
@@ -907,7 +907,7 @@
               <w:szCs w:val="15"/>
               <w:rtl w:val="0"/>
             </w:rPr>
-            <w:t xml:space="preserve">● </w:t>
+            <w:t xml:space="preserve">● Data &amp; APIs: PostgreSQL, MySQL, Redis, SQL, REST API design, PostgreSQL JSONB, CTEs, partial indexes, schema-per-tenant design</w:t>
           </w:r>
         </w:sdtContent>
       </w:sdt>
@@ -919,23 +919,23 @@
           <w:szCs w:val="15"/>
           <w:rtl w:val="0"/>
         </w:rPr>
-        <w:t xml:space="preserve">Data &amp; APIs</w:t>
-      </w:r>
-      <w:r>
-        <w:rPr>
-          <w:sz w:val="15"/>
-          <w:szCs w:val="15"/>
-          <w:rtl w:val="0"/>
-        </w:rPr>
-        <w:t xml:space="preserve">:</w:t>
-      </w:r>
-      <w:r>
-        <w:rPr>
-          <w:sz w:val="15"/>
-          <w:szCs w:val="15"/>
-          <w:rtl w:val="0"/>
-        </w:rPr>
-        <w:t xml:space="preserve"> PostgreSQL, MySQL, Redis, SQL, REST API design, PostgreSQL JSONB, CTEs, partial indexes, schema-per-tenant design</w:t>
+        <w:t xml:space="preserve"/>
+      </w:r>
+      <w:r>
+        <w:rPr>
+          <w:sz w:val="15"/>
+          <w:szCs w:val="15"/>
+          <w:rtl w:val="0"/>
+        </w:rPr>
+        <w:t xml:space="preserve"/>
+      </w:r>
+      <w:r>
+        <w:rPr>
+          <w:sz w:val="15"/>
+          <w:szCs w:val="15"/>
+          <w:rtl w:val="0"/>
+        </w:rPr>
+        <w:t xml:space="preserve"/>
       </w:r>
     </w:p>
     <w:p>
@@ -1053,7 +1053,7 @@
               <w:szCs w:val="15"/>
               <w:rtl w:val="0"/>
             </w:rPr>
-            <w:t xml:space="preserve">● </w:t>
+            <w:t xml:space="preserve">● Cloud &amp; DevOps: Docker, AWS S3 / R2 object storage, Redis (cache &amp; Horizon queues), GitHub Actions</w:t>
           </w:r>
         </w:sdtContent>
       </w:sdt>
@@ -1065,15 +1065,15 @@
           <w:szCs w:val="15"/>
           <w:rtl w:val="0"/>
         </w:rPr>
-        <w:t xml:space="preserve">Cloud &amp; DevOps: </w:t>
-      </w:r>
-      <w:r>
-        <w:rPr>
-          <w:sz w:val="15"/>
-          <w:szCs w:val="15"/>
-          <w:rtl w:val="0"/>
-        </w:rPr>
-        <w:t xml:space="preserve">Docker, GitHub Actions</w:t>
+        <w:t xml:space="preserve"/>
+      </w:r>
+      <w:r>
+        <w:rPr>
+          <w:sz w:val="15"/>
+          <w:szCs w:val="15"/>
+          <w:rtl w:val="0"/>
+        </w:rPr>
+        <w:t xml:space="preserve"/>
       </w:r>
       <w:r>
         <w:rPr>
@@ -1346,7 +1346,7 @@
           <w:szCs w:val="16"/>
           <w:rtl w:val="0"/>
         </w:rPr>
-        <w:t xml:space="preserve">Hypervel Billing Service | Financial microservice · Hypervel/Swoole, PostgreSQL</w:t>
+        <w:t xml:space="preserve">Hypervel Billing Service | Financial microservice · Hypervel/Swoole, PostgreSQL, Redis, S3                                     Storage Station   Jan 2026</w:t>
       </w:r>
       <w:r>
         <w:rPr>
@@ -1357,7 +1357,7 @@
           <w:szCs w:val="18"/>
           <w:rtl w:val="0"/>
         </w:rPr>
-        <w:t xml:space="preserve">      </w:t>
+        <w:t xml:space="preserve"/>
       </w:r>
       <w:r>
         <w:rPr>
@@ -1368,7 +1368,7 @@
           <w:szCs w:val="20"/>
           <w:rtl w:val="0"/>
         </w:rPr>
-        <w:t xml:space="preserve">                               </w:t>
+        <w:t xml:space="preserve"/>
       </w:r>
       <w:r>
         <w:rPr>
@@ -1377,7 +1377,7 @@
           <w:szCs w:val="17"/>
           <w:rtl w:val="0"/>
         </w:rPr>
-        <w:t xml:space="preserve">Storage Station   Jan 2026</w:t>
+        <w:t xml:space="preserve"/>
       </w:r>
       <w:r>
         <w:rPr>
@@ -1497,7 +1497,7 @@
           <w:szCs w:val="15"/>
           <w:rtl w:val="0"/>
         </w:rPr>
-        <w:t xml:space="preserve">• Built PostgreSQL CTE-based invoicing and credit reports with unit-tested query logic; delivered Docker, health checks, GitHub Actions test gating, semver tagging.</w:t>
+        <w:t xml:space="preserve">• Built PostgreSQL CTE-based invoicing and credit reports with unit-tested query logic; stored report artifacts on S3; used Redis in the service runtime; delivered Docker, health checks, GitHub Actions test gating, and semver tagging.</w:t>
       </w:r>
     </w:p>
     <w:p>
@@ -1525,7 +1525,7 @@
           <w:szCs w:val="16"/>
           <w:rtl w:val="0"/>
         </w:rPr>
-        <w:t xml:space="preserve">Survey Service — integration platform (Laravel 13, PostgreSQL, Filament)</w:t>
+        <w:t xml:space="preserve">Survey Service — integration platform (Laravel 13, PostgreSQL, Filament, Redis)                                              Storage Station   Jun 2026</w:t>
       </w:r>
       <w:r>
         <w:rPr>
@@ -1536,7 +1536,7 @@
           <w:szCs w:val="20"/>
           <w:rtl w:val="0"/>
         </w:rPr>
-        <w:t xml:space="preserve">                                      </w:t>
+        <w:t xml:space="preserve"/>
       </w:r>
       <w:r>
         <w:rPr>
@@ -1545,7 +1545,7 @@
           <w:szCs w:val="17"/>
           <w:rtl w:val="0"/>
         </w:rPr>
-        <w:t xml:space="preserve">        Storage Station   Jun 2026</w:t>
+        <w:t xml:space="preserve"/>
       </w:r>
       <w:r>
         <w:rPr>
@@ -1974,7 +1974,7 @@
           <w:szCs w:val="15"/>
           <w:rtl w:val="0"/>
         </w:rPr>
-        <w:t xml:space="preserve">• Developed shipping AWB lifecycle automation with Horizon-queued carrier-status synchronization and automatic cancellation/refund-request</w:t>
+        <w:t xml:space="preserve">• Developed shipping AWB lifecycle automation with Redis-backed Horizon queues for carrier-status synchronization and automatic cancellation/refund-request</w:t>
       </w:r>
     </w:p>
     <w:p>
@@ -2158,7 +2158,7 @@
           <w:szCs w:val="15"/>
           <w:rtl w:val="0"/>
         </w:rPr>
-        <w:t xml:space="preserve">• Implemented bank-account change and customer document workflows with supporting-document uploads, temp_bank_updates API-table</w:t>
+        <w:t xml:space="preserve">• Implemented AWS S3 object storage for shipping labels, settlement PDFs, financial proofs, and generated reports via dedicated Laravel disks (s3, public_s3, shipping_labels_s3).</w:t>
       </w:r>
     </w:p>
     <w:p>
@@ -2181,7 +2181,7 @@
           <w:szCs w:val="15"/>
           <w:rtl w:val="0"/>
         </w:rPr>
-        <w:t xml:space="preserve">handling, migrations, and customer/admin notifications.</w:t>
+        <w:t xml:space="preserve">• Used Redis for shipment configuration/cities caching with stampede locks and Redis-down bypass, plus Laravel Horizon workers on Redis queues for shipments and reports.</w:t>
       </w:r>
     </w:p>
     <w:p>
@@ -2392,7 +2392,7 @@
           <w:szCs w:val="15"/>
           <w:rtl w:val="0"/>
         </w:rPr>
-        <w:t xml:space="preserve">  • Modeled financial-domain APIs for safes, banks, branches, and account statuses with validation-heavy business rules in the service layer.</w:t>
+        <w:t xml:space="preserve">• Modeled financial-domain APIs for safes, banks, branches, and account statuses with validation-heavy business rules in the service layer on MySQL.</w:t>
       </w:r>
     </w:p>
     <w:p>
@@ -2415,7 +2415,7 @@
           <w:szCs w:val="15"/>
           <w:rtl w:val="0"/>
         </w:rPr>
-        <w:t xml:space="preserve">  • Built server-side validation for dynamic purchase and expense workflows used by AJAX admin forms.</w:t>
+        <w:t xml:space="preserve">• Designed and optimized MySQL schemas and queries for the Goods classified-ads platform (listings, subscriptions, payments), supporting Filament admin and mobile clients.</w:t>
       </w:r>
       <w:r>
         <w:rPr>
@@ -2534,7 +2534,7 @@
           <w:szCs w:val="15"/>
           <w:rtl w:val="0"/>
         </w:rPr>
-        <w:t xml:space="preserve"> • Maintained authenticated REST APIs with RBAC authorization and MySQL schema/query optimization;participated in API contract design and code review for frontend integration.</w:t>
+        <w:t xml:space="preserve">• Built and maintained Laravel REST APIs on MySQL with RBAC authorization, focusing on schema and query efficiency for financial and operational modules; collaborated on API contracts and code review with frontend teams.</w:t>
       </w:r>
     </w:p>
     <w:p>
@@ -2611,27 +2611,27 @@
           <w:szCs w:val="15"/>
           <w:rtl w:val="0"/>
         </w:rPr>
-        <w:t xml:space="preserve">  • </w:t>
-      </w:r>
-      <w:r>
-        <w:rPr>
-          <w:b w:val="1"/>
-          <w:bCs w:val="1"/>
-          <w:color w:val="374246"/>
-          <w:sz w:val="15"/>
-          <w:szCs w:val="15"/>
-          <w:rtl w:val="0"/>
-        </w:rPr>
-        <w:t xml:space="preserve">Goods Platform— 3Hand:  </w:t>
-      </w:r>
-      <w:r>
-        <w:rPr>
-          <w:color w:val="374246"/>
-          <w:sz w:val="15"/>
-          <w:szCs w:val="15"/>
-          <w:rtl w:val="0"/>
-        </w:rPr>
-        <w:t xml:space="preserve">Filament admin, RBAC, and Paymob subscriptions. </w:t>
+        <w:t xml:space="preserve">  • Goods Platform — 3Hand: Laravel/MySQL, Filament admin, RBAC, and Paymob subscriptions. goods.eg           Sept 2024</w:t>
+      </w:r>
+      <w:r>
+        <w:rPr>
+          <w:b w:val="1"/>
+          <w:bCs w:val="1"/>
+          <w:color w:val="374246"/>
+          <w:sz w:val="15"/>
+          <w:szCs w:val="15"/>
+          <w:rtl w:val="0"/>
+        </w:rPr>
+        <w:t xml:space="preserve"/>
+      </w:r>
+      <w:r>
+        <w:rPr>
+          <w:color w:val="374246"/>
+          <w:sz w:val="15"/>
+          <w:szCs w:val="15"/>
+          <w:rtl w:val="0"/>
+        </w:rPr>
+        <w:t xml:space="preserve"/>
       </w:r>
       <w:hyperlink r:id="rId12">
         <w:r>
@@ -2642,7 +2642,7 @@
             <w:u w:val="single"/>
             <w:rtl w:val="0"/>
           </w:rPr>
-          <w:t xml:space="preserve">goods.eg</w:t>
+          <w:t xml:space="preserve"/>
         </w:r>
       </w:hyperlink>
       <w:r>
@@ -2657,7 +2657,7 @@
         <w:tab/>
         <w:tab/>
         <w:tab/>
-        <w:t xml:space="preserve">           Sept 2024</w:t>
+        <w:t xml:space="preserve"/>
       </w:r>
     </w:p>
     <w:p>
@@ -2692,56 +2692,56 @@
           <w:szCs w:val="15"/>
           <w:rtl w:val="0"/>
         </w:rPr>
-        <w:t xml:space="preserve">  • </w:t>
-      </w:r>
-      <w:r>
-        <w:rPr>
-          <w:b w:val="1"/>
-          <w:bCs w:val="1"/>
-          <w:color w:val="374246"/>
-          <w:sz w:val="15"/>
-          <w:szCs w:val="15"/>
-          <w:rtl w:val="0"/>
-        </w:rPr>
-        <w:t xml:space="preserve">Inventory Management</w:t>
-      </w:r>
-      <w:r>
-        <w:rPr>
-          <w:color w:val="374246"/>
-          <w:sz w:val="15"/>
-          <w:szCs w:val="15"/>
-          <w:rtl w:val="0"/>
-        </w:rPr>
-        <w:t xml:space="preserve"> </w:t>
-      </w:r>
-      <w:r>
-        <w:rPr>
-          <w:b w:val="1"/>
-          <w:bCs w:val="1"/>
-          <w:color w:val="374246"/>
-          <w:sz w:val="15"/>
-          <w:szCs w:val="15"/>
-          <w:rtl w:val="0"/>
-        </w:rPr>
-        <w:t xml:space="preserve">— EPIK:</w:t>
-      </w:r>
-      <w:r>
-        <w:rPr>
-          <w:color w:val="374246"/>
-          <w:sz w:val="15"/>
-          <w:szCs w:val="15"/>
-          <w:rtl w:val="0"/>
-        </w:rPr>
-        <w:t xml:space="preserve"> </w:t>
-      </w:r>
-      <w:r>
-        <w:rPr>
-          <w:color w:val="374246"/>
-          <w:sz w:val="15"/>
-          <w:szCs w:val="15"/>
-          <w:rtl w:val="0"/>
-        </w:rPr>
-        <w:t xml:space="preserve"> purchase/sales order and stock tracking APIs                                                                                          Apr  2024</w:t>
+        <w:t xml:space="preserve">  • Inventory Management — EPIK: MySQL-backed purchase/sales order and stock tracking APIs                                                                                          Apr  2024</w:t>
+      </w:r>
+      <w:r>
+        <w:rPr>
+          <w:b w:val="1"/>
+          <w:bCs w:val="1"/>
+          <w:color w:val="374246"/>
+          <w:sz w:val="15"/>
+          <w:szCs w:val="15"/>
+          <w:rtl w:val="0"/>
+        </w:rPr>
+        <w:t xml:space="preserve"/>
+      </w:r>
+      <w:r>
+        <w:rPr>
+          <w:color w:val="374246"/>
+          <w:sz w:val="15"/>
+          <w:szCs w:val="15"/>
+          <w:rtl w:val="0"/>
+        </w:rPr>
+        <w:t xml:space="preserve"/>
+      </w:r>
+      <w:r>
+        <w:rPr>
+          <w:b w:val="1"/>
+          <w:bCs w:val="1"/>
+          <w:color w:val="374246"/>
+          <w:sz w:val="15"/>
+          <w:szCs w:val="15"/>
+          <w:rtl w:val="0"/>
+        </w:rPr>
+        <w:t xml:space="preserve"/>
+      </w:r>
+      <w:r>
+        <w:rPr>
+          <w:color w:val="374246"/>
+          <w:sz w:val="15"/>
+          <w:szCs w:val="15"/>
+          <w:rtl w:val="0"/>
+        </w:rPr>
+        <w:t xml:space="preserve"/>
+      </w:r>
+      <w:r>
+        <w:rPr>
+          <w:color w:val="374246"/>
+          <w:sz w:val="15"/>
+          <w:szCs w:val="15"/>
+          <w:rtl w:val="0"/>
+        </w:rPr>
+        <w:t xml:space="preserve"/>
       </w:r>
       <w:r>
         <w:rPr>

</xml_diff>

<commit_message>
Replace existing PDF resume with a new version and add a PDF export of the Word document.
</commit_message>
<xml_diff>
--- a/Maher_Mostafa_Backend_Software_Engineer_Resume.docx
+++ b/Maher_Mostafa_Backend_Software_Engineer_Resume.docx
@@ -638,7 +638,45 @@
           <w:szCs w:val="15"/>
           <w:rtl w:val="0"/>
         </w:rPr>
-        <w:t xml:space="preserve">Backend Software Engineer specializing in Laravel, PHP, PostgreSQL, and MySQL. Experienced building and maintaining production backend systems for financial workflows, payment integrations, multi-tenant applications, and operational platforms—using Redis for queues/caching and AWS S3 for document storage—with a strong focus on data correctness, reliable processing, and maintainable service boundaries.</w:t>
+        <w:t xml:space="preserve">Backend Software Engineer specializing in Laravel, PHP, PostgreSQL, and MySQL. Experienced building and maintaining production backend systems for financial</w:t>
+      </w:r>
+    </w:p>
+    <w:p>
+      <w:pPr>
+        <w:spacing w:before="5" w:line="360" w:lineRule="auto"/>
+        <w:rPr>
+          <w:color w:val="374246"/>
+          <w:sz w:val="15"/>
+          <w:szCs w:val="15"/>
+        </w:rPr>
+      </w:pPr>
+      <w:r>
+        <w:rPr>
+          <w:color w:val="374246"/>
+          <w:sz w:val="15"/>
+          <w:szCs w:val="15"/>
+          <w:rtl w:val="0"/>
+        </w:rPr>
+        <w:t xml:space="preserve">workflows, payment integrations, multi-tenant applications, and operational platforms—using Redis for queues/caching and AWS S3 for document storage—with</w:t>
+      </w:r>
+    </w:p>
+    <w:p>
+      <w:pPr>
+        <w:spacing w:before="5" w:line="360" w:lineRule="auto"/>
+        <w:rPr>
+          <w:color w:val="374246"/>
+          <w:sz w:val="15"/>
+          <w:szCs w:val="15"/>
+        </w:rPr>
+      </w:pPr>
+      <w:r>
+        <w:rPr>
+          <w:color w:val="374246"/>
+          <w:sz w:val="15"/>
+          <w:szCs w:val="15"/>
+          <w:rtl w:val="0"/>
+        </w:rPr>
+        <w:t xml:space="preserve">a strong focus on data correctness, reliable processing, and maintainable service boundaries.</w:t>
       </w:r>
       <w:r>
         <w:rPr>
@@ -850,7 +888,7 @@
       </w:pPr>
       <w:sdt>
         <w:sdtPr>
-          <w:id w:val="-665096903"/>
+          <w:id w:val="2055058082"/>
           <w:tag w:val="goog_rdk_0"/>
         </w:sdtPr>
         <w:sdtContent>
@@ -896,7 +934,7 @@
       </w:pPr>
       <w:sdt>
         <w:sdtPr>
-          <w:id w:val="-1293548741"/>
+          <w:id w:val="1596791233"/>
           <w:tag w:val="goog_rdk_1"/>
         </w:sdtPr>
         <w:sdtContent>
@@ -907,7 +945,7 @@
               <w:szCs w:val="15"/>
               <w:rtl w:val="0"/>
             </w:rPr>
-            <w:t xml:space="preserve">● Data &amp; APIs: PostgreSQL, MySQL, Redis, SQL, REST API design, PostgreSQL JSONB, CTEs, partial indexes, schema-per-tenant design</w:t>
+            <w:t xml:space="preserve">● </w:t>
           </w:r>
         </w:sdtContent>
       </w:sdt>
@@ -919,23 +957,23 @@
           <w:szCs w:val="15"/>
           <w:rtl w:val="0"/>
         </w:rPr>
-        <w:t xml:space="preserve"/>
-      </w:r>
-      <w:r>
-        <w:rPr>
-          <w:sz w:val="15"/>
-          <w:szCs w:val="15"/>
-          <w:rtl w:val="0"/>
-        </w:rPr>
-        <w:t xml:space="preserve"/>
-      </w:r>
-      <w:r>
-        <w:rPr>
-          <w:sz w:val="15"/>
-          <w:szCs w:val="15"/>
-          <w:rtl w:val="0"/>
-        </w:rPr>
-        <w:t xml:space="preserve"/>
+        <w:t xml:space="preserve">Data &amp; APIs</w:t>
+      </w:r>
+      <w:r>
+        <w:rPr>
+          <w:sz w:val="15"/>
+          <w:szCs w:val="15"/>
+          <w:rtl w:val="0"/>
+        </w:rPr>
+        <w:t xml:space="preserve">:</w:t>
+      </w:r>
+      <w:r>
+        <w:rPr>
+          <w:sz w:val="15"/>
+          <w:szCs w:val="15"/>
+          <w:rtl w:val="0"/>
+        </w:rPr>
+        <w:t xml:space="preserve"> PostgreSQL, MySQL, Redis, SQL, REST API design, PostgreSQL JSONB, CTEs, partial indexes, schema-per-tenant design</w:t>
       </w:r>
     </w:p>
     <w:p>
@@ -950,7 +988,7 @@
       </w:pPr>
       <w:sdt>
         <w:sdtPr>
-          <w:id w:val="-114111"/>
+          <w:id w:val="1026497045"/>
           <w:tag w:val="goog_rdk_2"/>
         </w:sdtPr>
         <w:sdtContent>
@@ -996,7 +1034,7 @@
       </w:pPr>
       <w:sdt>
         <w:sdtPr>
-          <w:id w:val="-2062797498"/>
+          <w:id w:val="1284144317"/>
           <w:tag w:val="goog_rdk_3"/>
         </w:sdtPr>
         <w:sdtContent>
@@ -1042,7 +1080,7 @@
       </w:pPr>
       <w:sdt>
         <w:sdtPr>
-          <w:id w:val="-1039355130"/>
+          <w:id w:val="1252571704"/>
           <w:tag w:val="goog_rdk_4"/>
         </w:sdtPr>
         <w:sdtContent>
@@ -1053,7 +1091,7 @@
               <w:szCs w:val="15"/>
               <w:rtl w:val="0"/>
             </w:rPr>
-            <w:t xml:space="preserve">● Cloud &amp; DevOps: Docker, AWS S3 / R2 object storage, Redis (cache &amp; Horizon queues), GitHub Actions</w:t>
+            <w:t xml:space="preserve">● </w:t>
           </w:r>
         </w:sdtContent>
       </w:sdt>
@@ -1065,15 +1103,15 @@
           <w:szCs w:val="15"/>
           <w:rtl w:val="0"/>
         </w:rPr>
-        <w:t xml:space="preserve"/>
-      </w:r>
-      <w:r>
-        <w:rPr>
-          <w:sz w:val="15"/>
-          <w:szCs w:val="15"/>
-          <w:rtl w:val="0"/>
-        </w:rPr>
-        <w:t xml:space="preserve"/>
+        <w:t xml:space="preserve">Cloud &amp; DevOps: </w:t>
+      </w:r>
+      <w:r>
+        <w:rPr>
+          <w:sz w:val="15"/>
+          <w:szCs w:val="15"/>
+          <w:rtl w:val="0"/>
+        </w:rPr>
+        <w:t xml:space="preserve">Docker, AWS S3 / R2 object storage, Redis (cache &amp; Horizon queues), GitHub Actions</w:t>
       </w:r>
       <w:r>
         <w:rPr>
@@ -1346,7 +1384,7 @@
           <w:szCs w:val="16"/>
           <w:rtl w:val="0"/>
         </w:rPr>
-        <w:t xml:space="preserve">Hypervel Billing Service | Financial microservice · Hypervel/Swoole, PostgreSQL, Redis, S3                                     Storage Station   Jan 2026</w:t>
+        <w:t xml:space="preserve">Hypervel Billing Service | Financial microservice · Hypervel/Swoole, PostgreSQL</w:t>
       </w:r>
       <w:r>
         <w:rPr>
@@ -1357,7 +1395,7 @@
           <w:szCs w:val="18"/>
           <w:rtl w:val="0"/>
         </w:rPr>
-        <w:t xml:space="preserve"/>
+        <w:t xml:space="preserve">      </w:t>
       </w:r>
       <w:r>
         <w:rPr>
@@ -1368,7 +1406,7 @@
           <w:szCs w:val="20"/>
           <w:rtl w:val="0"/>
         </w:rPr>
-        <w:t xml:space="preserve"/>
+        <w:t xml:space="preserve">                               </w:t>
       </w:r>
       <w:r>
         <w:rPr>
@@ -1377,7 +1415,7 @@
           <w:szCs w:val="17"/>
           <w:rtl w:val="0"/>
         </w:rPr>
-        <w:t xml:space="preserve"/>
+        <w:t xml:space="preserve">Storage Station   Jan 2026</w:t>
       </w:r>
       <w:r>
         <w:rPr>
@@ -1497,7 +1535,7 @@
           <w:szCs w:val="15"/>
           <w:rtl w:val="0"/>
         </w:rPr>
-        <w:t xml:space="preserve">• Built PostgreSQL CTE-based invoicing and credit reports with unit-tested query logic; stored report artifacts on S3; used Redis in the service runtime; delivered Docker, health checks, GitHub Actions test gating, and semver tagging.</w:t>
+        <w:t xml:space="preserve">• Built PostgreSQL CTE-based invoicing and credit reports with unit-tested query logic; delivered Docker, health checks, GitHub Actions test gating, semver tagging.</w:t>
       </w:r>
     </w:p>
     <w:p>
@@ -1525,7 +1563,7 @@
           <w:szCs w:val="16"/>
           <w:rtl w:val="0"/>
         </w:rPr>
-        <w:t xml:space="preserve">Survey Service — integration platform (Laravel 13, PostgreSQL, Filament, Redis)                                              Storage Station   Jun 2026</w:t>
+        <w:t xml:space="preserve">Survey Service — integration platform (Laravel 13, PostgreSQL, Filament)</w:t>
       </w:r>
       <w:r>
         <w:rPr>
@@ -1536,7 +1574,7 @@
           <w:szCs w:val="20"/>
           <w:rtl w:val="0"/>
         </w:rPr>
-        <w:t xml:space="preserve"/>
+        <w:t xml:space="preserve">                                      </w:t>
       </w:r>
       <w:r>
         <w:rPr>
@@ -1545,7 +1583,7 @@
           <w:szCs w:val="17"/>
           <w:rtl w:val="0"/>
         </w:rPr>
-        <w:t xml:space="preserve"/>
+        <w:t xml:space="preserve">        Storage Station   Jun 2026</w:t>
       </w:r>
       <w:r>
         <w:rPr>
@@ -1568,7 +1606,7 @@
       </w:pPr>
       <w:sdt>
         <w:sdtPr>
-          <w:id w:val="1271482665"/>
+          <w:id w:val="-706120638"/>
           <w:tag w:val="goog_rdk_5"/>
         </w:sdtPr>
         <w:sdtContent>
@@ -1669,7 +1707,7 @@
       </w:pPr>
       <w:sdt>
         <w:sdtPr>
-          <w:id w:val="161552732"/>
+          <w:id w:val="2100182548"/>
           <w:tag w:val="goog_rdk_6"/>
         </w:sdtPr>
         <w:sdtContent>
@@ -1706,11 +1744,22 @@
           <w:b w:val="1"/>
           <w:bCs w:val="1"/>
           <w:color w:val="6f7878"/>
+          <w:sz w:val="16"/>
+          <w:szCs w:val="16"/>
+          <w:rtl w:val="0"/>
+        </w:rPr>
+        <w:t xml:space="preserve">Packing Item System | Reusable Laravel package</w:t>
+      </w:r>
+      <w:r>
+        <w:rPr>
+          <w:b w:val="1"/>
+          <w:bCs w:val="1"/>
+          <w:color w:val="6f7878"/>
           <w:sz w:val="18"/>
           <w:szCs w:val="18"/>
           <w:rtl w:val="0"/>
         </w:rPr>
-        <w:t xml:space="preserve">Packing Item System | Reusable Laravel package                                                        </w:t>
+        <w:t xml:space="preserve">                                                        </w:t>
       </w:r>
       <w:r>
         <w:rPr>
@@ -1825,25 +1874,6 @@
           <w:rtl w:val="0"/>
         </w:rPr>
         <w:t xml:space="preserve">• Added polymorphic request/response audit records for carrier integrations without coupling domain models to carrier APIs.</w:t>
-      </w:r>
-    </w:p>
-    <w:p>
-      <w:pPr>
-        <w:tabs>
-          <w:tab w:val="left" w:leader="none" w:pos="357"/>
-        </w:tabs>
-        <w:spacing w:before="35" w:line="360" w:lineRule="auto"/>
-        <w:ind w:right="921"/>
-        <w:rPr>
-          <w:color w:val="374246"/>
-          <w:sz w:val="15"/>
-          <w:szCs w:val="15"/>
-        </w:rPr>
-      </w:pPr>
-      <w:r>
-        <w:rPr>
-          <w:rtl w:val="0"/>
-        </w:rPr>
       </w:r>
     </w:p>
     <w:p>
@@ -1974,7 +2004,7 @@
           <w:szCs w:val="15"/>
           <w:rtl w:val="0"/>
         </w:rPr>
-        <w:t xml:space="preserve">• Developed shipping AWB lifecycle automation with Redis-backed Horizon queues for carrier-status synchronization and automatic cancellation/refund-request</w:t>
+        <w:t xml:space="preserve">• Developed shipping AWB lifecycle automation with Redis-backed Horizon queues for carrier-status synchronization and automatic cancellation/refund-request handling when AWBs are deleted or cancelled.</w:t>
       </w:r>
     </w:p>
     <w:p>
@@ -1997,7 +2027,7 @@
           <w:szCs w:val="15"/>
           <w:rtl w:val="0"/>
         </w:rPr>
-        <w:t xml:space="preserve">handling when AWBs are deleted or cancelled.</w:t>
+        <w:t xml:space="preserve">• Extended the config-driven storageitsolutions/api-tables admin layer to support plan/carrier pricing management, payment-transaction observability, and shipping-AWB operational actions.</w:t>
       </w:r>
     </w:p>
     <w:p>
@@ -2020,7 +2050,7 @@
           <w:szCs w:val="15"/>
           <w:rtl w:val="0"/>
         </w:rPr>
-        <w:t xml:space="preserve">• Extended the config-driven storageitsolutions/api-tables admin layer to support plan/carrier pricing management, payment-transaction</w:t>
+        <w:t xml:space="preserve">• Delivered scheduled Excel operational reports for customer invoicing, monthly credits, and points conversion through SendCustomReportEmailJob</w:t>
       </w:r>
     </w:p>
     <w:p>
@@ -2043,7 +2073,7 @@
           <w:szCs w:val="15"/>
           <w:rtl w:val="0"/>
         </w:rPr>
-        <w:t xml:space="preserve">observability, and shipping-AWB operational actions.</w:t>
+        <w:t xml:space="preserve">on Horizon’s reports queue.</w:t>
       </w:r>
     </w:p>
     <w:p>
@@ -2066,7 +2096,7 @@
           <w:szCs w:val="15"/>
           <w:rtl w:val="0"/>
         </w:rPr>
-        <w:t xml:space="preserve">• Delivered scheduled Excel operational reports for customer invoicing, monthly credits, and points conversion through SendCustomReportEmailJob</w:t>
+        <w:t xml:space="preserve">• Improved production integrations by adding SPL National Address and HERE short-address lookup APIs with credit validation, and by hardening</w:t>
       </w:r>
     </w:p>
     <w:p>
@@ -2089,7 +2119,7 @@
           <w:szCs w:val="15"/>
           <w:rtl w:val="0"/>
         </w:rPr>
-        <w:t xml:space="preserve">on Horizon’s reports queue.</w:t>
+        <w:t xml:space="preserve">Salla, Salla-plugin, and Shopify order-ingestion against stuck unique-constraint failures.</w:t>
       </w:r>
     </w:p>
     <w:p>
@@ -2112,7 +2142,7 @@
           <w:szCs w:val="15"/>
           <w:rtl w:val="0"/>
         </w:rPr>
-        <w:t xml:space="preserve">• Improved production integrations by adding SPL National Address and HERE short-address lookup APIs with credit validation, and by hardening</w:t>
+        <w:t xml:space="preserve">• Implemented AWS S3 object storage for shipping labels, settlement PDFs, financial proofs, and generated reports via dedicated Laravel disks (s3, public_s3, shipping_labels_s3).</w:t>
       </w:r>
     </w:p>
     <w:p>
@@ -2135,7 +2165,7 @@
           <w:szCs w:val="15"/>
           <w:rtl w:val="0"/>
         </w:rPr>
-        <w:t xml:space="preserve">Salla, Salla-plugin, and Shopify order-ingestion against stuck unique-constraint failures.</w:t>
+        <w:t xml:space="preserve">• Used Redis for shipment configuration/cities caching with stampede locks and Redis-down bypass, plus Laravel Horizon workers on Redis queues for shipments and reports.</w:t>
       </w:r>
     </w:p>
     <w:p>
@@ -2153,12 +2183,75 @@
       </w:pPr>
       <w:r>
         <w:rPr>
-          <w:color w:val="374246"/>
-          <w:sz w:val="15"/>
-          <w:szCs w:val="15"/>
-          <w:rtl w:val="0"/>
-        </w:rPr>
-        <w:t xml:space="preserve">• Implemented AWS S3 object storage for shipping labels, settlement PDFs, financial proofs, and generated reports via dedicated Laravel disks (s3, public_s3, shipping_labels_s3).</w:t>
+          <w:rtl w:val="0"/>
+        </w:rPr>
+      </w:r>
+    </w:p>
+    <w:p>
+      <w:pPr>
+        <w:tabs>
+          <w:tab w:val="left" w:leader="none" w:pos="9857"/>
+        </w:tabs>
+        <w:spacing w:before="50" w:line="360" w:lineRule="auto"/>
+        <w:ind w:right="11"/>
+        <w:rPr>
+          <w:sz w:val="17"/>
+          <w:szCs w:val="17"/>
+        </w:rPr>
+      </w:pPr>
+      <w:r>
+        <w:rPr>
+          <w:b w:val="1"/>
+          <w:bCs w:val="1"/>
+          <w:color w:val="6f7878"/>
+          <w:sz w:val="20"/>
+          <w:szCs w:val="20"/>
+          <w:rtl w:val="0"/>
+        </w:rPr>
+        <w:t xml:space="preserve">CareQ — salon booking platform                                                                                          </w:t>
+      </w:r>
+      <w:r>
+        <w:rPr>
+          <w:color w:val="374246"/>
+          <w:sz w:val="17"/>
+          <w:szCs w:val="17"/>
+          <w:rtl w:val="0"/>
+        </w:rPr>
+        <w:t xml:space="preserve">Storage Station   </w:t>
+      </w:r>
+      <w:r>
+        <w:rPr>
+          <w:b w:val="1"/>
+          <w:bCs w:val="1"/>
+          <w:color w:val="6f7878"/>
+          <w:sz w:val="20"/>
+          <w:szCs w:val="20"/>
+          <w:rtl w:val="0"/>
+        </w:rPr>
+        <w:t xml:space="preserve"> </w:t>
+      </w:r>
+      <w:r>
+        <w:rPr>
+          <w:color w:val="374246"/>
+          <w:sz w:val="17"/>
+          <w:szCs w:val="17"/>
+          <w:rtl w:val="0"/>
+        </w:rPr>
+        <w:t xml:space="preserve">May 2025</w:t>
+      </w:r>
+      <w:r>
+        <w:rPr>
+          <w:color w:val="6f7878"/>
+          <w:sz w:val="20"/>
+          <w:szCs w:val="20"/>
+          <w:rtl w:val="0"/>
+        </w:rPr>
+        <w:t xml:space="preserve"> </w:t>
+      </w:r>
+      <w:r>
+        <w:rPr>
+          <w:rtl w:val="0"/>
+        </w:rPr>
       </w:r>
     </w:p>
     <w:p>
@@ -2169,118 +2262,11 @@
         <w:spacing w:before="35" w:line="360" w:lineRule="auto"/>
         <w:ind w:right="921"/>
         <w:rPr>
-          <w:color w:val="374246"/>
-          <w:sz w:val="15"/>
-          <w:szCs w:val="15"/>
-        </w:rPr>
-      </w:pPr>
-      <w:r>
-        <w:rPr>
-          <w:color w:val="374246"/>
-          <w:sz w:val="15"/>
-          <w:szCs w:val="15"/>
-          <w:rtl w:val="0"/>
-        </w:rPr>
-        <w:t xml:space="preserve">• Used Redis for shipment configuration/cities caching with stampede locks and Redis-down bypass, plus Laravel Horizon workers on Redis queues for shipments and reports.</w:t>
-      </w:r>
-    </w:p>
-    <w:p>
-      <w:pPr>
-        <w:tabs>
-          <w:tab w:val="left" w:leader="none" w:pos="357"/>
-        </w:tabs>
-        <w:spacing w:before="35" w:line="360" w:lineRule="auto"/>
-        <w:ind w:right="921"/>
-        <w:rPr>
-          <w:color w:val="374246"/>
-          <w:sz w:val="15"/>
-          <w:szCs w:val="15"/>
-        </w:rPr>
-      </w:pPr>
-      <w:r>
-        <w:rPr>
-          <w:rtl w:val="0"/>
-        </w:rPr>
-      </w:r>
-    </w:p>
-    <w:p>
-      <w:pPr>
-        <w:tabs>
-          <w:tab w:val="left" w:leader="none" w:pos="9857"/>
-        </w:tabs>
-        <w:spacing w:before="50" w:line="360" w:lineRule="auto"/>
-        <w:ind w:right="11"/>
-        <w:rPr>
-          <w:sz w:val="17"/>
-          <w:szCs w:val="17"/>
-        </w:rPr>
-      </w:pPr>
-      <w:r>
-        <w:rPr>
           <w:b w:val="1"/>
           <w:bCs w:val="1"/>
           <w:color w:val="6f7878"/>
           <w:sz w:val="20"/>
           <w:szCs w:val="20"/>
-          <w:rtl w:val="0"/>
-        </w:rPr>
-        <w:t xml:space="preserve">CareQ — salon booking platform                                                                                          </w:t>
-      </w:r>
-      <w:r>
-        <w:rPr>
-          <w:color w:val="374246"/>
-          <w:sz w:val="17"/>
-          <w:szCs w:val="17"/>
-          <w:rtl w:val="0"/>
-        </w:rPr>
-        <w:t xml:space="preserve">Storage Station   </w:t>
-      </w:r>
-      <w:r>
-        <w:rPr>
-          <w:b w:val="1"/>
-          <w:bCs w:val="1"/>
-          <w:color w:val="6f7878"/>
-          <w:sz w:val="20"/>
-          <w:szCs w:val="20"/>
-          <w:rtl w:val="0"/>
-        </w:rPr>
-        <w:t xml:space="preserve"> </w:t>
-      </w:r>
-      <w:r>
-        <w:rPr>
-          <w:color w:val="374246"/>
-          <w:sz w:val="17"/>
-          <w:szCs w:val="17"/>
-          <w:rtl w:val="0"/>
-        </w:rPr>
-        <w:t xml:space="preserve">May 2025</w:t>
-      </w:r>
-      <w:r>
-        <w:rPr>
-          <w:color w:val="6f7878"/>
-          <w:sz w:val="20"/>
-          <w:szCs w:val="20"/>
-          <w:rtl w:val="0"/>
-        </w:rPr>
-        <w:t xml:space="preserve"> </w:t>
-      </w:r>
-      <w:r>
-        <w:rPr>
-          <w:rtl w:val="0"/>
-        </w:rPr>
-      </w:r>
-    </w:p>
-    <w:p>
-      <w:pPr>
-        <w:tabs>
-          <w:tab w:val="left" w:leader="none" w:pos="357"/>
-        </w:tabs>
-        <w:spacing w:before="35" w:line="360" w:lineRule="auto"/>
-        <w:ind w:right="921"/>
-        <w:rPr>
-          <w:color w:val="374246"/>
-          <w:sz w:val="15"/>
-          <w:szCs w:val="15"/>
         </w:rPr>
       </w:pPr>
       <w:r>
@@ -2291,6 +2277,11 @@
           <w:rtl w:val="0"/>
         </w:rPr>
         <w:t xml:space="preserve">• Built concurrent-safe slot reservation with expiry and role-separated authentication using Sanctum and OTP; used PostgreSQL/PostGIS for serviceable-area constraints and Laravel Octane/RoadRunner.</w:t>
+      </w:r>
+      <w:r>
+        <w:rPr>
+          <w:rtl w:val="0"/>
+        </w:rPr>
       </w:r>
     </w:p>
     <w:p>
@@ -2392,7 +2383,7 @@
           <w:szCs w:val="15"/>
           <w:rtl w:val="0"/>
         </w:rPr>
-        <w:t xml:space="preserve">• Modeled financial-domain APIs for safes, banks, branches, and account statuses with validation-heavy business rules in the service layer on MySQL.</w:t>
+        <w:t xml:space="preserve">• Modeled financial-domain APIs for safes, banks, branches, and account statuses with validation-heavy business rules in the service layer on    MySQL.</w:t>
       </w:r>
     </w:p>
     <w:p>
@@ -2534,7 +2525,7 @@
           <w:szCs w:val="15"/>
           <w:rtl w:val="0"/>
         </w:rPr>
-        <w:t xml:space="preserve">• Built and maintained Laravel REST APIs on MySQL with RBAC authorization, focusing on schema and query efficiency for financial and operational modules; collaborated on API contracts and code review with frontend teams.</w:t>
+        <w:t xml:space="preserve"> • Built and maintained Laravel REST APIs on MySQL with RBAC authorization, focusing on schema and query efficiency for financial and operational modules; collaborated on API contracts and code review with frontend teams..</w:t>
       </w:r>
     </w:p>
     <w:p>
@@ -2611,27 +2602,27 @@
           <w:szCs w:val="15"/>
           <w:rtl w:val="0"/>
         </w:rPr>
-        <w:t xml:space="preserve">  • Goods Platform — 3Hand: Laravel/MySQL, Filament admin, RBAC, and Paymob subscriptions. goods.eg           Sept 2024</w:t>
-      </w:r>
-      <w:r>
-        <w:rPr>
-          <w:b w:val="1"/>
-          <w:bCs w:val="1"/>
-          <w:color w:val="374246"/>
-          <w:sz w:val="15"/>
-          <w:szCs w:val="15"/>
-          <w:rtl w:val="0"/>
-        </w:rPr>
-        <w:t xml:space="preserve"/>
-      </w:r>
-      <w:r>
-        <w:rPr>
-          <w:color w:val="374246"/>
-          <w:sz w:val="15"/>
-          <w:szCs w:val="15"/>
-          <w:rtl w:val="0"/>
-        </w:rPr>
-        <w:t xml:space="preserve"/>
+        <w:t xml:space="preserve">  • </w:t>
+      </w:r>
+      <w:r>
+        <w:rPr>
+          <w:b w:val="1"/>
+          <w:bCs w:val="1"/>
+          <w:color w:val="374246"/>
+          <w:sz w:val="15"/>
+          <w:szCs w:val="15"/>
+          <w:rtl w:val="0"/>
+        </w:rPr>
+        <w:t xml:space="preserve">Goods Platform— 3Hand:  </w:t>
+      </w:r>
+      <w:r>
+        <w:rPr>
+          <w:color w:val="374246"/>
+          <w:sz w:val="15"/>
+          <w:szCs w:val="15"/>
+          <w:rtl w:val="0"/>
+        </w:rPr>
+        <w:t xml:space="preserve">Filament admin, RBAC, and Paymob subscriptions. </w:t>
       </w:r>
       <w:hyperlink r:id="rId12">
         <w:r>
@@ -2642,7 +2633,7 @@
             <w:u w:val="single"/>
             <w:rtl w:val="0"/>
           </w:rPr>
-          <w:t xml:space="preserve"/>
+          <w:t xml:space="preserve">goods.eg</w:t>
         </w:r>
       </w:hyperlink>
       <w:r>
@@ -2657,7 +2648,7 @@
         <w:tab/>
         <w:tab/>
         <w:tab/>
-        <w:t xml:space="preserve"/>
+        <w:t xml:space="preserve">           Sept 2024</w:t>
       </w:r>
     </w:p>
     <w:p>
@@ -2692,56 +2683,56 @@
           <w:szCs w:val="15"/>
           <w:rtl w:val="0"/>
         </w:rPr>
-        <w:t xml:space="preserve">  • Inventory Management — EPIK: MySQL-backed purchase/sales order and stock tracking APIs                                                                                          Apr  2024</w:t>
-      </w:r>
-      <w:r>
-        <w:rPr>
-          <w:b w:val="1"/>
-          <w:bCs w:val="1"/>
-          <w:color w:val="374246"/>
-          <w:sz w:val="15"/>
-          <w:szCs w:val="15"/>
-          <w:rtl w:val="0"/>
-        </w:rPr>
-        <w:t xml:space="preserve"/>
-      </w:r>
-      <w:r>
-        <w:rPr>
-          <w:color w:val="374246"/>
-          <w:sz w:val="15"/>
-          <w:szCs w:val="15"/>
-          <w:rtl w:val="0"/>
-        </w:rPr>
-        <w:t xml:space="preserve"/>
-      </w:r>
-      <w:r>
-        <w:rPr>
-          <w:b w:val="1"/>
-          <w:bCs w:val="1"/>
-          <w:color w:val="374246"/>
-          <w:sz w:val="15"/>
-          <w:szCs w:val="15"/>
-          <w:rtl w:val="0"/>
-        </w:rPr>
-        <w:t xml:space="preserve"/>
-      </w:r>
-      <w:r>
-        <w:rPr>
-          <w:color w:val="374246"/>
-          <w:sz w:val="15"/>
-          <w:szCs w:val="15"/>
-          <w:rtl w:val="0"/>
-        </w:rPr>
-        <w:t xml:space="preserve"/>
-      </w:r>
-      <w:r>
-        <w:rPr>
-          <w:color w:val="374246"/>
-          <w:sz w:val="15"/>
-          <w:szCs w:val="15"/>
-          <w:rtl w:val="0"/>
-        </w:rPr>
-        <w:t xml:space="preserve"/>
+        <w:t xml:space="preserve">  • </w:t>
+      </w:r>
+      <w:r>
+        <w:rPr>
+          <w:b w:val="1"/>
+          <w:bCs w:val="1"/>
+          <w:color w:val="374246"/>
+          <w:sz w:val="15"/>
+          <w:szCs w:val="15"/>
+          <w:rtl w:val="0"/>
+        </w:rPr>
+        <w:t xml:space="preserve">Inventory Management</w:t>
+      </w:r>
+      <w:r>
+        <w:rPr>
+          <w:color w:val="374246"/>
+          <w:sz w:val="15"/>
+          <w:szCs w:val="15"/>
+          <w:rtl w:val="0"/>
+        </w:rPr>
+        <w:t xml:space="preserve"> </w:t>
+      </w:r>
+      <w:r>
+        <w:rPr>
+          <w:b w:val="1"/>
+          <w:bCs w:val="1"/>
+          <w:color w:val="374246"/>
+          <w:sz w:val="15"/>
+          <w:szCs w:val="15"/>
+          <w:rtl w:val="0"/>
+        </w:rPr>
+        <w:t xml:space="preserve">— EPIK:</w:t>
+      </w:r>
+      <w:r>
+        <w:rPr>
+          <w:color w:val="374246"/>
+          <w:sz w:val="15"/>
+          <w:szCs w:val="15"/>
+          <w:rtl w:val="0"/>
+        </w:rPr>
+        <w:t xml:space="preserve"> </w:t>
+      </w:r>
+      <w:r>
+        <w:rPr>
+          <w:color w:val="374246"/>
+          <w:sz w:val="15"/>
+          <w:szCs w:val="15"/>
+          <w:rtl w:val="0"/>
+        </w:rPr>
+        <w:t xml:space="preserve"> purchase/sales order and stock tracking APIs                                                                                          Apr  2024</w:t>
       </w:r>
       <w:r>
         <w:rPr>

</xml_diff>